<commit_message>
docs: the AI plan, and D31: our own model writes VCL, never VBA
Boss approved the recommendation on 19 Oct 2026. docs/ai-plan.md sets
the general direction after the MVP: the model writes VCL from plain
English and repairs failing specs; the compiler stays the only thing
that writes VBA, so every model output is proven by the toolchain
without Excel. NOTE steps shrink as VCL grows instead of the model
writing raw VBA. It lists how VCL's structure helps, the planned VCL
changes (a GOAL line, a formatter, error codes, fewer NOTE steps, a
small language, strong TESTs), the in-house data sources and the stages.

D31 records the decision and replaces D25's "beats the compiler" test.
CLAUDE.md, the README, the MVP plan, the context file and the roadmap
.docx's model lines now say the same. No code or language changes.

Co-Authored-By: Claude Opus 5.5 <noreply@anthropic.com>
Claude-Session: https://claude.ai/code/session_013eMSbFzYAkvtcoQfhHvrqe
</commit_message>
<xml_diff>
--- a/docs/VBA_Forge_Project_Roadmap.docx
+++ b/docs/VBA_Forge_Project_Roadmap.docx
@@ -56,7 +56,7 @@
           <w:sz w:val="22"/>
           <w:szCs w:val="22"/>
         </w:rPr>
-        <w:t>As of 18 October 2026 (model strategy revised by decision D25)</w:t>
+        <w:t>As of 19 October 2026 (model strategy revised by decisions D25 and D31: our own model writes VCL, never VBA; see docs/ai-plan.md)</w:t>
       </w:r>
     </w:p>
     <w:p>
@@ -303,7 +303,7 @@
         <w:t>Specialize through data.</w:t>
       </w:r>
       <w:r>
-        <w:t xml:space="preserve"> Our own model learns VCL to VBA only from verified in-house examples. It is trained from zero for this one job, not adapted from a general model.</w:t>
+        <w:t xml:space="preserve"> Our own model learns plain English to VCL only from verified in-house examples; the compiler writes all the VBA (D31). It is trained from zero for this one job, not adapted from a general model.</w:t>
       </w:r>
     </w:p>
     <w:p>
@@ -323,7 +323,7 @@
         <w:t xml:space="preserve">Deterministic first, AI second.</w:t>
       </w:r>
       <w:r>
-        <w:t xml:space="preserve"> Known patterns compile from tested templates. The model handles only what templates cannot.</w:t>
+        <w:t xml:space="preserve"> Known patterns compile from tested templates and the compiler. The model writes VCL for them to compile, never VBA (D31).</w:t>
       </w:r>
     </w:p>
     <w:p>
@@ -622,7 +622,7 @@
               <w:spacing w:line="264"/>
             </w:pPr>
             <w:r>
-              <w:t>Claude (or you) writes VCL. Our own model is trained from zero only on in-house VCL to VBA pairs.</w:t>
+              <w:t>Claude (or you, and later our own model) writes VCL. Our own model is trained from zero only on in-house English-to-VCL pairs and never writes VBA; the compiler does (D31).</w:t>
             </w:r>
           </w:p>
         </w:tc>
@@ -2003,7 +2003,7 @@
         <w:spacing w:after="140" w:line="276"/>
       </w:pPr>
       <w:r>
-        <w:t xml:space="preserve">A request becomes a VCL spec, gets validated, is compiled by a template or the local model, and must pass the test harness before it is saved to your library.</w:t>
+        <w:t>A request becomes a VCL spec (written by Claude, by you, or later by our own model), gets validated, passes its TESTs and is compiled to VBA by the compiler before it is saved to your library. The model never writes VBA (D31).</w:t>
       </w:r>
     </w:p>
     <w:p>
@@ -2057,7 +2057,7 @@
         <w:spacing w:after="140" w:line="276"/>
       </w:pPr>
       <w:r>
-        <w:t xml:space="preserve">Templates handle known patterns with no AI. The model only sees what templates can't cover, and every failure loops back through repair at most 3 times before it returns to you.</w:t>
+        <w:t>Templates and the compiler handle everything VCL can say, with no AI. The model writes VCL from plain English and repairs specs that fail a check; every failure loops back through repair at most 3 times before it returns to you (D31).</w:t>
       </w:r>
     </w:p>
     <w:p>
@@ -2977,7 +2977,7 @@
               <w:spacing w:line="264"/>
             </w:pPr>
             <w:r>
-              <w:t xml:space="preserve">Template if one matches, else the model</w:t>
+              <w:t>Template if one matches, else the compiler; the model writes VCL only (D31)</w:t>
             </w:r>
           </w:p>
         </w:tc>
@@ -6371,7 +6371,7 @@
         <w:spacing w:after="140" w:line="276"/>
       </w:pPr>
       <w:r>
-        <w:t>The model outputs one procedure and nothing else, between fixed markers. Grammar-constrained decoding enforces this, so prose is impossible.</w:t>
+        <w:t>The model outputs one VCL spec and nothing else, between fixed markers. Grammar-constrained decoding enforces this, so prose is impossible (D31).</w:t>
       </w:r>
     </w:p>
     <w:p>
@@ -7984,7 +7984,7 @@
         <w:spacing w:after="140" w:line="276"/>
       </w:pPr>
       <w:r>
-        <w:t>Build our own model and choose its size by testing (D25): in March, train 2–3 small model sizes from zero on the in-house dataset and score each on VBA-Bench against the compiler baseline. A version ships only where it beats the compiler. The model is ours from the first weight: no pre-trained base model, and no fine-tuning of someone else's model.</w:t>
+        <w:t>Build our own model and choose its size by testing (D25): in March, train 2–3 small model sizes from zero on the in-house dataset and score each on the held-out benchmark by how many of its specs pass the whole toolchain. The model writes VCL, never VBA, so it doesn't compete with the compiler (D31): it is used once it passes enough benchmark tasks, and Claude stays the Orchestrator until then. The model is ours from the first weight: no pre-trained base model, and no fine-tuning of someone else's model.</w:t>
       </w:r>
     </w:p>
     <w:p>
@@ -8039,7 +8039,7 @@
         <w:spacing w:after="80" w:line="276"/>
       </w:pPr>
       <w:r>
-        <w:t>Beats the compiler baseline on VBA-Bench in every category it is used for.</w:t>
+        <w:t>Passes enough of the held-out benchmark (the bar is set in March) in every category it is used for (D31).</w:t>
       </w:r>
     </w:p>
     <w:p>
@@ -10675,7 +10675,7 @@
         <w:spacing w:after="140" w:line="276"/>
       </w:pPr>
       <w:r>
-        <w:t xml:space="preserve">VBA Forge builds big tools the way a good team does: Claude writes the architecture as a BUILD spec, the local model writes one procedure at a time, and every piece is tested before assembly.</w:t>
+        <w:t>VBA Forge builds big tools the way a good team does: Claude writes the architecture as a BUILD spec, each procedure is a TASK spec (written by Claude or, later, our own model) that the compiler turns into VBA one at a time, and every piece is tested before assembly (D31).</w:t>
       </w:r>
     </w:p>
     <w:p>
@@ -10714,7 +10714,7 @@
         <w:spacing w:after="80" w:line="276"/>
       </w:pPr>
       <w:r>
-        <w:t xml:space="preserve">The router sends each TASK to a template or the model, leaf procedures first.</w:t>
+        <w:t>The router sends each TASK to a template or the compiler, leaf procedures first; the model only writes or repairs VCL (D31).</w:t>
       </w:r>
     </w:p>
     <w:p>
@@ -10931,7 +10931,7 @@
         <w:t xml:space="preserve">.frx</w:t>
       </w:r>
       <w:r>
-        <w:t xml:space="preserve"> companion, so they can't be written as plain text. VBA Forge generates a builder procedure that creates the form through the VBE Designer (controls, positions, captions) plus the form's event code. v1 ships a few template layouts (input form, picker, progress bar, settings), and the model fills in the event handlers.</w:t>
+        <w:t xml:space="preserve"> companion, so they can't be written as plain text. VBA Forge generates a builder procedure that creates the form through the VBE Designer (controls, positions, captions) plus the form's event code. v1 ships a few template layouts (input form, picker, progress bar, settings), and the event handlers are TASK specs, compiled like any other (D31).</w:t>
       </w:r>
     </w:p>
     <w:p>
@@ -11499,7 +11499,7 @@
         <w:spacing w:after="80" w:line="276"/>
       </w:pPr>
       <w:r>
-        <w:t>Record the compiler's VBA-Bench score as the baseline our own model must beat</w:t>
+        <w:t>Record Claude's benchmark score (Claude writing the specs) as the reference our own model chases (D31)</w:t>
       </w:r>
     </w:p>
     <w:p>
@@ -11520,7 +11520,7 @@
         <w:spacing w:after="80" w:line="276"/>
       </w:pPr>
       <w:r>
-        <w:t>Train our own model from zero on the in-house TASK and repair pairs</w:t>
+        <w:t>Train our own model from zero on the in-house English-to-VCL and repair pairs (D31)</w:t>
       </w:r>
     </w:p>
     <w:p>
@@ -11580,7 +11580,7 @@
         <w:spacing w:after="80" w:line="276"/>
       </w:pPr>
       <w:r>
-        <w:t xml:space="preserve">Router: template first, model as fallback</w:t>
+        <w:t>Router: templates and the compiler write the VBA; the model writes VCL only (D31)</w:t>
       </w:r>
     </w:p>
     <w:p>
@@ -12306,7 +12306,7 @@
         <w:spacing w:after="140" w:line="276"/>
       </w:pPr>
       <w:r>
-        <w:t>Two reference scores frame every result: the in-house compiler (the floor our own model must beat) and Claude on the same bench (the ceiling to chase).</w:t>
+        <w:t>Two reference scores frame every result: Claude writing the specs (the ceiling to chase) and the bar set in March for using our own model. Every spec is compiled by the compiler, so the compiler is no longer the model's rival (D31).</w:t>
       </w:r>
     </w:p>
     <w:p>
@@ -13026,7 +13026,7 @@
               <w:spacing w:line="264"/>
             </w:pPr>
             <w:r>
-              <w:t>Compiler first: the model handles only what the compiler can't (NOTE steps, repairs) and ships only where it beats the compiler on VBA-Bench (D25).</w:t>
+              <w:t>Compiler first: the model writes VCL only (plain English to VCL, repairs), every output is proven by the toolchain, and it is used once it passes enough of the benchmark (D25, D31).</w:t>
             </w:r>
           </w:p>
         </w:tc>

</xml_diff>